<commit_message>
nlp references and methodology
</commit_message>
<xml_diff>
--- a/NLP/Thesis/Thesis.docx
+++ b/NLP/Thesis/Thesis.docx
@@ -10,8 +10,8 @@
           <w:rFonts w:ascii="Times New Roman" w:eastAsia="Times New Roman" w:hAnsi="Times New Roman" w:cs="Times New Roman"/>
           <w:b/>
           <w:color w:val="1F497D" w:themeColor="text2"/>
-          <w:sz w:val="32"/>
-          <w:szCs w:val="32"/>
+          <w:sz w:val="36"/>
+          <w:szCs w:val="36"/>
         </w:rPr>
       </w:pPr>
       <w:r>
@@ -19,8 +19,8 @@
           <w:rFonts w:ascii="Times New Roman" w:eastAsia="Times New Roman" w:hAnsi="Times New Roman" w:cs="Times New Roman"/>
           <w:b/>
           <w:color w:val="1F497D" w:themeColor="text2"/>
-          <w:sz w:val="32"/>
-          <w:szCs w:val="32"/>
+          <w:sz w:val="36"/>
+          <w:szCs w:val="36"/>
         </w:rPr>
         <w:t>Comparison performance o</w:t>
       </w:r>
@@ -29,8 +29,8 @@
           <w:rFonts w:ascii="Times New Roman" w:eastAsia="Times New Roman" w:hAnsi="Times New Roman" w:cs="Times New Roman"/>
           <w:b/>
           <w:color w:val="1F497D" w:themeColor="text2"/>
-          <w:sz w:val="32"/>
-          <w:szCs w:val="32"/>
+          <w:sz w:val="36"/>
+          <w:szCs w:val="36"/>
         </w:rPr>
         <w:t>f Conditional Random Fields</w:t>
       </w:r>
@@ -39,8 +39,8 @@
           <w:rFonts w:ascii="Times New Roman" w:eastAsia="Times New Roman" w:hAnsi="Times New Roman" w:cs="Times New Roman"/>
           <w:b/>
           <w:color w:val="1F497D" w:themeColor="text2"/>
-          <w:sz w:val="32"/>
-          <w:szCs w:val="32"/>
+          <w:sz w:val="36"/>
+          <w:szCs w:val="36"/>
         </w:rPr>
         <w:t xml:space="preserve"> and </w:t>
       </w:r>
@@ -49,8 +49,8 @@
           <w:rFonts w:ascii="Times New Roman" w:eastAsia="Times New Roman" w:hAnsi="Times New Roman" w:cs="Times New Roman"/>
           <w:b/>
           <w:color w:val="1F497D" w:themeColor="text2"/>
-          <w:sz w:val="32"/>
-          <w:szCs w:val="32"/>
+          <w:sz w:val="36"/>
+          <w:szCs w:val="36"/>
         </w:rPr>
         <w:t>Random Forest u</w:t>
       </w:r>
@@ -59,8 +59,8 @@
           <w:rFonts w:ascii="Times New Roman" w:eastAsia="Times New Roman" w:hAnsi="Times New Roman" w:cs="Times New Roman"/>
           <w:b/>
           <w:color w:val="1F497D" w:themeColor="text2"/>
-          <w:sz w:val="32"/>
-          <w:szCs w:val="32"/>
+          <w:sz w:val="36"/>
+          <w:szCs w:val="36"/>
         </w:rPr>
         <w:t>sing the CoNLL-2003 Dataset</w:t>
       </w:r>
@@ -92,19 +92,6 @@
     <w:p>
       <w:pPr>
         <w:spacing w:line="360" w:lineRule="auto"/>
-        <w:jc w:val="center"/>
-        <w:rPr>
-          <w:rFonts w:ascii="Times New Roman" w:eastAsia="Times New Roman" w:hAnsi="Times New Roman" w:cs="Times New Roman"/>
-          <w:b/>
-          <w:sz w:val="24"/>
-          <w:szCs w:val="24"/>
-        </w:rPr>
-      </w:pPr>
-    </w:p>
-    <w:p>
-      <w:pPr>
-        <w:spacing w:line="360" w:lineRule="auto"/>
-        <w:jc w:val="center"/>
         <w:rPr>
           <w:rFonts w:ascii="Times New Roman" w:eastAsia="MS Mincho" w:hAnsi="Times New Roman" w:cs="Times New Roman"/>
           <w:b/>
@@ -114,7 +101,10 @@
           <w:lang w:val="en-US"/>
         </w:rPr>
       </w:pPr>
-      <w:r>
+    </w:p>
+    <w:p>
+      <w:pPr>
+        <w:spacing w:line="360" w:lineRule="auto"/>
         <w:rPr>
           <w:rFonts w:ascii="Times New Roman" w:eastAsia="MS Mincho" w:hAnsi="Times New Roman" w:cs="Times New Roman"/>
           <w:b/>
@@ -123,331 +113,6 @@
           <w:szCs w:val="24"/>
           <w:lang w:val="en-US"/>
         </w:rPr>
-        <w:t>ANTHONY BUSH CASTRO</w:t>
-      </w:r>
-      <w:r>
-        <w:rPr>
-          <w:rFonts w:ascii="Times New Roman" w:eastAsia="MS Mincho" w:hAnsi="Times New Roman" w:cs="Times New Roman"/>
-          <w:b/>
-          <w:bCs/>
-          <w:sz w:val="24"/>
-          <w:szCs w:val="24"/>
-          <w:lang w:val="en-US"/>
-        </w:rPr>
-        <w:t xml:space="preserve">  </w:t>
-      </w:r>
-      <w:r>
-        <w:rPr>
-          <w:rFonts w:ascii="Times New Roman" w:eastAsia="MS Mincho" w:hAnsi="Times New Roman" w:cs="Times New Roman"/>
-          <w:b/>
-          <w:bCs/>
-          <w:sz w:val="24"/>
-          <w:szCs w:val="24"/>
-          <w:lang w:val="en-US"/>
-        </w:rPr>
-        <w:t>20</w:t>
-      </w:r>
-      <w:r>
-        <w:rPr>
-          <w:rFonts w:ascii="Times New Roman" w:eastAsia="MS Mincho" w:hAnsi="Times New Roman" w:cs="Times New Roman"/>
-          <w:b/>
-          <w:bCs/>
-          <w:sz w:val="24"/>
-          <w:szCs w:val="24"/>
-          <w:lang w:val="en-US"/>
-        </w:rPr>
-        <w:t>-C</w:t>
-      </w:r>
-      <w:r>
-        <w:rPr>
-          <w:rFonts w:ascii="Times New Roman" w:eastAsia="MS Mincho" w:hAnsi="Times New Roman" w:cs="Times New Roman"/>
-          <w:b/>
-          <w:bCs/>
-          <w:sz w:val="24"/>
-          <w:szCs w:val="24"/>
-          <w:lang w:val="en-US"/>
-        </w:rPr>
-        <w:t>CS</w:t>
-      </w:r>
-      <w:r>
-        <w:rPr>
-          <w:rFonts w:ascii="Times New Roman" w:eastAsia="MS Mincho" w:hAnsi="Times New Roman" w:cs="Times New Roman"/>
-          <w:b/>
-          <w:bCs/>
-          <w:sz w:val="24"/>
-          <w:szCs w:val="24"/>
-          <w:lang w:val="en-US"/>
-        </w:rPr>
-        <w:t>-</w:t>
-      </w:r>
-      <w:r>
-        <w:rPr>
-          <w:rFonts w:ascii="Times New Roman" w:eastAsia="MS Mincho" w:hAnsi="Times New Roman" w:cs="Times New Roman"/>
-          <w:b/>
-          <w:bCs/>
-          <w:sz w:val="24"/>
-          <w:szCs w:val="24"/>
-          <w:lang w:val="en-US"/>
-        </w:rPr>
-        <w:t>281</w:t>
-      </w:r>
-    </w:p>
-    <w:p>
-      <w:pPr>
-        <w:spacing w:line="360" w:lineRule="auto"/>
-        <w:jc w:val="center"/>
-        <w:rPr>
-          <w:rFonts w:ascii="Times New Roman" w:eastAsia="MS Mincho" w:hAnsi="Times New Roman" w:cs="Times New Roman"/>
-          <w:b/>
-          <w:bCs/>
-          <w:sz w:val="24"/>
-          <w:szCs w:val="24"/>
-          <w:lang w:val="en-US"/>
-        </w:rPr>
-      </w:pPr>
-    </w:p>
-    <w:p>
-      <w:pPr>
-        <w:spacing w:line="360" w:lineRule="auto"/>
-        <w:jc w:val="center"/>
-        <w:rPr>
-          <w:rFonts w:ascii="Times New Roman" w:eastAsia="MS Mincho" w:hAnsi="Times New Roman" w:cs="Times New Roman"/>
-          <w:b/>
-          <w:bCs/>
-          <w:sz w:val="24"/>
-          <w:szCs w:val="24"/>
-          <w:lang w:val="en-US"/>
-        </w:rPr>
-      </w:pPr>
-      <w:r>
-        <w:rPr>
-          <w:rFonts w:ascii="Times New Roman" w:eastAsia="MS Mincho" w:hAnsi="Times New Roman" w:cs="Times New Roman"/>
-          <w:b/>
-          <w:bCs/>
-          <w:sz w:val="24"/>
-          <w:szCs w:val="24"/>
-          <w:lang w:val="en-US"/>
-        </w:rPr>
-        <w:t xml:space="preserve">Supervised By: Dr. </w:t>
-      </w:r>
-      <w:proofErr w:type="spellStart"/>
-      <w:r>
-        <w:rPr>
-          <w:rFonts w:ascii="Times New Roman" w:eastAsia="MS Mincho" w:hAnsi="Times New Roman" w:cs="Times New Roman"/>
-          <w:b/>
-          <w:bCs/>
-          <w:sz w:val="24"/>
-          <w:szCs w:val="24"/>
-          <w:lang w:val="en-US"/>
-        </w:rPr>
-        <w:t>Manzu</w:t>
-      </w:r>
-      <w:proofErr w:type="spellEnd"/>
-      <w:r>
-        <w:rPr>
-          <w:rFonts w:ascii="Times New Roman" w:eastAsia="MS Mincho" w:hAnsi="Times New Roman" w:cs="Times New Roman"/>
-          <w:b/>
-          <w:bCs/>
-          <w:sz w:val="24"/>
-          <w:szCs w:val="24"/>
-          <w:lang w:val="en-US"/>
-        </w:rPr>
-        <w:t xml:space="preserve"> Gerald S. Kenyi</w:t>
-      </w:r>
-      <w:r>
-        <w:rPr>
-          <w:rFonts w:ascii="Times New Roman" w:eastAsia="MS Mincho" w:hAnsi="Times New Roman" w:cs="Times New Roman"/>
-          <w:b/>
-          <w:bCs/>
-          <w:sz w:val="24"/>
-          <w:szCs w:val="24"/>
-          <w:lang w:val="en-US"/>
-        </w:rPr>
-        <w:t xml:space="preserve">,  </w:t>
-      </w:r>
-      <w:proofErr w:type="spellStart"/>
-      <w:r>
-        <w:rPr>
-          <w:rFonts w:ascii="Times New Roman" w:eastAsia="MS Mincho" w:hAnsi="Times New Roman" w:cs="Times New Roman"/>
-          <w:b/>
-          <w:bCs/>
-          <w:sz w:val="24"/>
-          <w:szCs w:val="24"/>
-          <w:lang w:val="en-US"/>
-        </w:rPr>
-        <w:t>Ph.D</w:t>
-      </w:r>
-      <w:proofErr w:type="spellEnd"/>
-    </w:p>
-    <w:p>
-      <w:pPr>
-        <w:spacing w:line="360" w:lineRule="auto"/>
-        <w:jc w:val="center"/>
-        <w:rPr>
-          <w:rFonts w:ascii="Times New Roman" w:eastAsia="MS Mincho" w:hAnsi="Times New Roman" w:cs="Times New Roman"/>
-          <w:b/>
-          <w:bCs/>
-          <w:sz w:val="24"/>
-          <w:szCs w:val="24"/>
-          <w:lang w:val="en-US"/>
-        </w:rPr>
-      </w:pPr>
-    </w:p>
-    <w:p>
-      <w:pPr>
-        <w:spacing w:line="360" w:lineRule="auto"/>
-        <w:jc w:val="center"/>
-        <w:rPr>
-          <w:rFonts w:ascii="Times New Roman" w:eastAsia="MS Mincho" w:hAnsi="Times New Roman" w:cs="Times New Roman"/>
-          <w:b/>
-          <w:bCs/>
-          <w:sz w:val="24"/>
-          <w:szCs w:val="24"/>
-          <w:lang w:val="en-US"/>
-        </w:rPr>
-      </w:pPr>
-    </w:p>
-    <w:p>
-      <w:pPr>
-        <w:spacing w:line="360" w:lineRule="auto"/>
-        <w:jc w:val="center"/>
-        <w:rPr>
-          <w:rFonts w:ascii="Times New Roman" w:eastAsia="MS Mincho" w:hAnsi="Times New Roman" w:cs="Times New Roman"/>
-          <w:b/>
-          <w:bCs/>
-          <w:sz w:val="24"/>
-          <w:szCs w:val="24"/>
-          <w:lang w:val="en-US"/>
-        </w:rPr>
-      </w:pPr>
-    </w:p>
-    <w:p>
-      <w:pPr>
-        <w:spacing w:line="360" w:lineRule="auto"/>
-        <w:jc w:val="center"/>
-        <w:rPr>
-          <w:rFonts w:ascii="Times New Roman" w:eastAsia="MS Mincho" w:hAnsi="Times New Roman" w:cs="Times New Roman"/>
-          <w:b/>
-          <w:color w:val="1F497D" w:themeColor="text2"/>
-          <w:sz w:val="28"/>
-          <w:szCs w:val="28"/>
-          <w:lang w:val="en-US"/>
-        </w:rPr>
-      </w:pPr>
-      <w:bookmarkStart w:id="0" w:name="_Hlk194925992"/>
-      <w:r>
-        <w:rPr>
-          <w:rFonts w:ascii="Times New Roman" w:eastAsia="MS Mincho" w:hAnsi="Times New Roman" w:cs="Times New Roman"/>
-          <w:b/>
-          <w:color w:val="1F497D" w:themeColor="text2"/>
-          <w:sz w:val="28"/>
-          <w:szCs w:val="28"/>
-          <w:lang w:val="en-US"/>
-        </w:rPr>
-        <w:t xml:space="preserve">Department of </w:t>
-      </w:r>
-      <w:r>
-        <w:rPr>
-          <w:rFonts w:ascii="Times New Roman" w:eastAsia="MS Mincho" w:hAnsi="Times New Roman" w:cs="Times New Roman"/>
-          <w:b/>
-          <w:color w:val="1F497D" w:themeColor="text2"/>
-          <w:sz w:val="28"/>
-          <w:szCs w:val="28"/>
-          <w:lang w:val="en-US"/>
-        </w:rPr>
-        <w:t>Computer Science</w:t>
-      </w:r>
-    </w:p>
-    <w:p>
-      <w:pPr>
-        <w:spacing w:line="360" w:lineRule="auto"/>
-        <w:jc w:val="center"/>
-        <w:rPr>
-          <w:rFonts w:ascii="Times New Roman" w:eastAsia="MS Mincho" w:hAnsi="Times New Roman" w:cs="Times New Roman"/>
-          <w:b/>
-          <w:color w:val="1F497D" w:themeColor="text2"/>
-          <w:sz w:val="28"/>
-          <w:szCs w:val="28"/>
-          <w:lang w:val="en-US"/>
-        </w:rPr>
-      </w:pPr>
-      <w:r>
-        <w:rPr>
-          <w:rFonts w:ascii="Times New Roman" w:eastAsia="MS Mincho" w:hAnsi="Times New Roman" w:cs="Times New Roman"/>
-          <w:b/>
-          <w:color w:val="1F497D" w:themeColor="text2"/>
-          <w:sz w:val="28"/>
-          <w:szCs w:val="28"/>
-          <w:lang w:val="en-US"/>
-        </w:rPr>
-        <w:t>School of Computer Science and Information Technology,</w:t>
-      </w:r>
-    </w:p>
-    <w:p>
-      <w:pPr>
-        <w:spacing w:line="360" w:lineRule="auto"/>
-        <w:jc w:val="center"/>
-        <w:rPr>
-          <w:rFonts w:ascii="Times New Roman" w:eastAsia="MS Mincho" w:hAnsi="Times New Roman" w:cs="Times New Roman"/>
-          <w:b/>
-          <w:color w:val="1F497D" w:themeColor="text2"/>
-          <w:sz w:val="28"/>
-          <w:szCs w:val="28"/>
-          <w:lang w:val="en-US"/>
-        </w:rPr>
-      </w:pPr>
-      <w:r>
-        <w:rPr>
-          <w:rFonts w:ascii="Times New Roman" w:eastAsia="MS Mincho" w:hAnsi="Times New Roman" w:cs="Times New Roman"/>
-          <w:b/>
-          <w:color w:val="1F497D" w:themeColor="text2"/>
-          <w:sz w:val="28"/>
-          <w:szCs w:val="28"/>
-          <w:lang w:val="en-US"/>
-        </w:rPr>
-        <w:t>University of Juba</w:t>
-      </w:r>
-    </w:p>
-    <w:bookmarkEnd w:id="0"/>
-    <w:p>
-      <w:pPr>
-        <w:spacing w:line="360" w:lineRule="auto"/>
-        <w:jc w:val="center"/>
-        <w:rPr>
-          <w:rFonts w:ascii="Times New Roman" w:eastAsia="MS Mincho" w:hAnsi="Times New Roman" w:cs="Times New Roman"/>
-          <w:b/>
-          <w:bCs/>
-          <w:sz w:val="24"/>
-          <w:szCs w:val="24"/>
-          <w:lang w:val="en-US"/>
-        </w:rPr>
-      </w:pPr>
-    </w:p>
-    <w:p>
-      <w:pPr>
-        <w:spacing w:line="360" w:lineRule="auto"/>
-        <w:jc w:val="center"/>
-        <w:rPr>
-          <w:rFonts w:ascii="Times New Roman" w:eastAsia="MS Mincho" w:hAnsi="Times New Roman" w:cs="Times New Roman"/>
-          <w:b/>
-          <w:bCs/>
-          <w:sz w:val="24"/>
-          <w:szCs w:val="24"/>
-          <w:lang w:val="en-US"/>
-        </w:rPr>
-      </w:pPr>
-    </w:p>
-    <w:p>
-      <w:pPr>
-        <w:spacing w:line="360" w:lineRule="auto"/>
-        <w:jc w:val="center"/>
-        <w:rPr>
-          <w:rFonts w:ascii="Times New Roman" w:eastAsia="Times New Roman" w:hAnsi="Times New Roman" w:cs="Times New Roman"/>
-          <w:b/>
-          <w:sz w:val="24"/>
-          <w:szCs w:val="24"/>
-          <w:lang w:val="en-US"/>
-        </w:rPr>
       </w:pPr>
       <w:r>
         <w:rPr>
@@ -457,13 +122,13 @@
           <w:szCs w:val="24"/>
         </w:rPr>
         <w:drawing>
-          <wp:anchor distT="0" distB="0" distL="114300" distR="114300" simplePos="0" relativeHeight="251659264" behindDoc="0" locked="0" layoutInCell="1" allowOverlap="1" wp14:anchorId="7F7A4D4E" wp14:editId="09043F8D">
+          <wp:anchor distT="0" distB="0" distL="114300" distR="114300" simplePos="0" relativeHeight="251659264" behindDoc="0" locked="0" layoutInCell="1" allowOverlap="1" wp14:anchorId="7F7A4D4E" wp14:editId="34DAB7E9">
             <wp:simplePos x="0" y="0"/>
             <wp:positionH relativeFrom="margin">
-              <wp:posOffset>2075815</wp:posOffset>
+              <wp:posOffset>1957705</wp:posOffset>
             </wp:positionH>
             <wp:positionV relativeFrom="page">
-              <wp:posOffset>5661454</wp:posOffset>
+              <wp:posOffset>2599268</wp:posOffset>
             </wp:positionV>
             <wp:extent cx="1574800" cy="1236980"/>
             <wp:effectExtent l="0" t="0" r="6350" b="1270"/>
@@ -516,168 +181,148 @@
     <w:p>
       <w:pPr>
         <w:spacing w:line="360" w:lineRule="auto"/>
-        <w:jc w:val="center"/>
-        <w:rPr>
-          <w:rFonts w:ascii="Times New Roman" w:eastAsia="Times New Roman" w:hAnsi="Times New Roman" w:cs="Times New Roman"/>
-          <w:b/>
-          <w:sz w:val="24"/>
-          <w:szCs w:val="24"/>
-        </w:rPr>
-      </w:pPr>
-    </w:p>
-    <w:p>
-      <w:pPr>
-        <w:spacing w:line="360" w:lineRule="auto"/>
-        <w:jc w:val="center"/>
-        <w:rPr>
-          <w:rFonts w:ascii="Times New Roman" w:eastAsia="Times New Roman" w:hAnsi="Times New Roman" w:cs="Times New Roman"/>
-          <w:b/>
-          <w:sz w:val="24"/>
-          <w:szCs w:val="24"/>
-        </w:rPr>
-      </w:pPr>
-    </w:p>
-    <w:p>
-      <w:pPr>
-        <w:spacing w:line="360" w:lineRule="auto"/>
-        <w:jc w:val="center"/>
-        <w:rPr>
-          <w:rFonts w:ascii="Times New Roman" w:eastAsia="Times New Roman" w:hAnsi="Times New Roman" w:cs="Times New Roman"/>
-          <w:b/>
-          <w:sz w:val="24"/>
-          <w:szCs w:val="24"/>
-        </w:rPr>
-      </w:pPr>
-    </w:p>
-    <w:p>
-      <w:pPr>
-        <w:spacing w:line="360" w:lineRule="auto"/>
-        <w:jc w:val="center"/>
-        <w:rPr>
-          <w:rFonts w:ascii="Times New Roman" w:eastAsia="Times New Roman" w:hAnsi="Times New Roman" w:cs="Times New Roman"/>
-          <w:sz w:val="24"/>
-          <w:szCs w:val="24"/>
-        </w:rPr>
-      </w:pPr>
-    </w:p>
-    <w:p>
-      <w:pPr>
-        <w:spacing w:line="360" w:lineRule="auto"/>
-        <w:jc w:val="center"/>
-        <w:rPr>
-          <w:rFonts w:ascii="Times New Roman" w:eastAsia="Times New Roman" w:hAnsi="Times New Roman" w:cs="Times New Roman"/>
-          <w:sz w:val="24"/>
-          <w:szCs w:val="24"/>
-        </w:rPr>
-      </w:pPr>
-    </w:p>
-    <w:p>
-      <w:pPr>
-        <w:spacing w:line="360" w:lineRule="auto"/>
-        <w:jc w:val="center"/>
-        <w:rPr>
-          <w:rFonts w:ascii="Times New Roman" w:eastAsia="Times New Roman" w:hAnsi="Times New Roman" w:cs="Times New Roman"/>
-          <w:sz w:val="24"/>
-          <w:szCs w:val="24"/>
-        </w:rPr>
-      </w:pPr>
-    </w:p>
-    <w:p>
-      <w:pPr>
-        <w:spacing w:line="360" w:lineRule="auto"/>
-        <w:jc w:val="center"/>
-        <w:rPr>
-          <w:rFonts w:ascii="Times New Roman" w:eastAsia="Times New Roman" w:hAnsi="Times New Roman" w:cs="Times New Roman"/>
-          <w:sz w:val="24"/>
-          <w:szCs w:val="24"/>
-        </w:rPr>
-      </w:pPr>
-    </w:p>
-    <w:p>
-      <w:pPr>
-        <w:spacing w:line="360" w:lineRule="auto"/>
-        <w:jc w:val="center"/>
-        <w:rPr>
-          <w:rFonts w:ascii="Times New Roman" w:eastAsia="Times New Roman" w:hAnsi="Times New Roman" w:cs="Times New Roman"/>
-          <w:sz w:val="24"/>
-          <w:szCs w:val="24"/>
-        </w:rPr>
-      </w:pPr>
-    </w:p>
-    <w:p>
-      <w:pPr>
-        <w:spacing w:line="360" w:lineRule="auto"/>
-        <w:jc w:val="center"/>
-        <w:rPr>
-          <w:rFonts w:ascii="Times New Roman" w:eastAsia="Times New Roman" w:hAnsi="Times New Roman" w:cs="Times New Roman"/>
-          <w:sz w:val="24"/>
-          <w:szCs w:val="24"/>
-        </w:rPr>
-      </w:pPr>
-    </w:p>
-    <w:p>
-      <w:pPr>
-        <w:spacing w:line="360" w:lineRule="auto"/>
-        <w:jc w:val="center"/>
         <w:rPr>
           <w:rFonts w:ascii="Times New Roman" w:eastAsia="MS Mincho" w:hAnsi="Times New Roman" w:cs="Times New Roman"/>
           <w:b/>
-          <w:sz w:val="24"/>
-          <w:szCs w:val="24"/>
-          <w:lang w:val="en-US"/>
-        </w:rPr>
-      </w:pPr>
-      <w:r>
+          <w:bCs/>
+          <w:sz w:val="24"/>
+          <w:szCs w:val="24"/>
+          <w:lang w:val="en-US"/>
+        </w:rPr>
+      </w:pPr>
+    </w:p>
+    <w:p>
+      <w:pPr>
+        <w:spacing w:line="360" w:lineRule="auto"/>
         <w:rPr>
           <w:rFonts w:ascii="Times New Roman" w:eastAsia="MS Mincho" w:hAnsi="Times New Roman" w:cs="Times New Roman"/>
           <w:b/>
-          <w:sz w:val="24"/>
-          <w:szCs w:val="24"/>
-          <w:lang w:val="en-US"/>
-        </w:rPr>
-        <w:t>Graduation Thesis submitted in partial fulfillment of the requirements leading to the award of Bachelor of Science (Hons) in Information Technology</w:t>
-      </w:r>
-    </w:p>
-    <w:p>
-      <w:pPr>
-        <w:spacing w:line="360" w:lineRule="auto"/>
-        <w:jc w:val="both"/>
+          <w:bCs/>
+          <w:sz w:val="24"/>
+          <w:szCs w:val="24"/>
+          <w:lang w:val="en-US"/>
+        </w:rPr>
+      </w:pPr>
+    </w:p>
+    <w:p>
+      <w:pPr>
+        <w:spacing w:line="360" w:lineRule="auto"/>
         <w:rPr>
           <w:rFonts w:ascii="Times New Roman" w:eastAsia="MS Mincho" w:hAnsi="Times New Roman" w:cs="Times New Roman"/>
-          <w:color w:val="000000"/>
-          <w:sz w:val="24"/>
-          <w:szCs w:val="24"/>
-          <w:lang w:val="en-US"/>
-        </w:rPr>
-      </w:pPr>
-    </w:p>
-    <w:p>
-      <w:pPr>
-        <w:spacing w:line="360" w:lineRule="auto"/>
+          <w:b/>
+          <w:bCs/>
+          <w:sz w:val="24"/>
+          <w:szCs w:val="24"/>
+          <w:lang w:val="en-US"/>
+        </w:rPr>
+      </w:pPr>
+    </w:p>
+    <w:p>
+      <w:pPr>
+        <w:spacing w:line="360" w:lineRule="auto"/>
+        <w:rPr>
+          <w:rFonts w:ascii="Times New Roman" w:eastAsia="MS Mincho" w:hAnsi="Times New Roman" w:cs="Times New Roman"/>
+          <w:b/>
+          <w:bCs/>
+          <w:sz w:val="24"/>
+          <w:szCs w:val="24"/>
+          <w:lang w:val="en-US"/>
+        </w:rPr>
+      </w:pPr>
+    </w:p>
+    <w:p>
+      <w:pPr>
+        <w:spacing w:line="360" w:lineRule="auto"/>
+        <w:rPr>
+          <w:rFonts w:ascii="Times New Roman" w:eastAsia="MS Mincho" w:hAnsi="Times New Roman" w:cs="Times New Roman"/>
+          <w:b/>
+          <w:bCs/>
+          <w:sz w:val="24"/>
+          <w:szCs w:val="24"/>
+          <w:lang w:val="en-US"/>
+        </w:rPr>
+      </w:pPr>
+    </w:p>
+    <w:p>
+      <w:pPr>
+        <w:spacing w:line="360" w:lineRule="auto"/>
+        <w:rPr>
+          <w:rFonts w:ascii="Times New Roman" w:eastAsia="MS Mincho" w:hAnsi="Times New Roman" w:cs="Times New Roman"/>
+          <w:b/>
+          <w:bCs/>
+          <w:sz w:val="24"/>
+          <w:szCs w:val="24"/>
+          <w:lang w:val="en-US"/>
+        </w:rPr>
+      </w:pPr>
+    </w:p>
+    <w:p>
+      <w:pPr>
+        <w:spacing w:line="360" w:lineRule="auto"/>
+        <w:rPr>
+          <w:rFonts w:ascii="Times New Roman" w:eastAsia="MS Mincho" w:hAnsi="Times New Roman" w:cs="Times New Roman"/>
+          <w:b/>
+          <w:bCs/>
+          <w:sz w:val="24"/>
+          <w:szCs w:val="24"/>
+          <w:lang w:val="en-US"/>
+        </w:rPr>
+      </w:pPr>
+    </w:p>
+    <w:p>
+      <w:pPr>
+        <w:spacing w:line="360" w:lineRule="auto"/>
+        <w:jc w:val="center"/>
+        <w:rPr>
+          <w:rFonts w:ascii="Times New Roman" w:eastAsia="MS Mincho" w:hAnsi="Times New Roman" w:cs="Times New Roman"/>
+          <w:b/>
+          <w:bCs/>
+          <w:color w:val="1F497D" w:themeColor="text2"/>
+          <w:sz w:val="32"/>
+          <w:szCs w:val="32"/>
+          <w:lang w:val="en-US"/>
+        </w:rPr>
+      </w:pPr>
+      <w:r>
+        <w:rPr>
+          <w:rFonts w:ascii="Times New Roman" w:eastAsia="MS Mincho" w:hAnsi="Times New Roman" w:cs="Times New Roman"/>
+          <w:b/>
+          <w:bCs/>
+          <w:color w:val="1F497D" w:themeColor="text2"/>
+          <w:sz w:val="32"/>
+          <w:szCs w:val="32"/>
+          <w:lang w:val="en-US"/>
+        </w:rPr>
+        <w:t>UNIVERSITY OF JUBA</w:t>
+      </w:r>
+    </w:p>
+    <w:p>
+      <w:pPr>
+        <w:spacing w:line="360" w:lineRule="auto"/>
+        <w:jc w:val="center"/>
         <w:rPr>
           <w:rFonts w:ascii="Times New Roman" w:eastAsia="MS Mincho" w:hAnsi="Times New Roman" w:cs="Times New Roman"/>
           <w:b/>
           <w:color w:val="1F497D" w:themeColor="text2"/>
-          <w:sz w:val="24"/>
-          <w:szCs w:val="24"/>
-          <w:lang w:val="en-US"/>
-        </w:rPr>
-      </w:pPr>
-    </w:p>
-    <w:p>
-      <w:pPr>
-        <w:spacing w:line="360" w:lineRule="auto"/>
-        <w:jc w:val="center"/>
+          <w:sz w:val="28"/>
+          <w:szCs w:val="28"/>
+          <w:lang w:val="en-US"/>
+        </w:rPr>
+      </w:pPr>
+      <w:bookmarkStart w:id="0" w:name="_Hlk194925992"/>
+      <w:r>
         <w:rPr>
           <w:rFonts w:ascii="Times New Roman" w:eastAsia="MS Mincho" w:hAnsi="Times New Roman" w:cs="Times New Roman"/>
           <w:b/>
           <w:color w:val="1F497D" w:themeColor="text2"/>
-          <w:sz w:val="24"/>
-          <w:szCs w:val="24"/>
-          <w:lang w:val="en-US"/>
-        </w:rPr>
-      </w:pPr>
-    </w:p>
+          <w:sz w:val="28"/>
+          <w:szCs w:val="28"/>
+          <w:lang w:val="en-US"/>
+        </w:rPr>
+        <w:t>School of Computer Science and Information Technology,</w:t>
+      </w:r>
+    </w:p>
+    <w:bookmarkEnd w:id="0"/>
     <w:p>
       <w:pPr>
         <w:spacing w:line="360" w:lineRule="auto"/>
@@ -686,6 +331,388 @@
           <w:rFonts w:ascii="Times New Roman" w:eastAsia="Times New Roman" w:hAnsi="Times New Roman" w:cs="Times New Roman"/>
           <w:sz w:val="24"/>
           <w:szCs w:val="24"/>
+        </w:rPr>
+      </w:pPr>
+      <w:r>
+        <w:rPr>
+          <w:rFonts w:ascii="Times New Roman" w:eastAsia="MS Mincho" w:hAnsi="Times New Roman" w:cs="Times New Roman"/>
+          <w:b/>
+          <w:color w:val="1F497D" w:themeColor="text2"/>
+          <w:sz w:val="28"/>
+          <w:szCs w:val="28"/>
+          <w:lang w:val="en-US"/>
+        </w:rPr>
+        <w:t xml:space="preserve">Department of </w:t>
+      </w:r>
+      <w:r>
+        <w:rPr>
+          <w:rFonts w:ascii="Times New Roman" w:eastAsia="MS Mincho" w:hAnsi="Times New Roman" w:cs="Times New Roman"/>
+          <w:b/>
+          <w:color w:val="1F497D" w:themeColor="text2"/>
+          <w:sz w:val="28"/>
+          <w:szCs w:val="28"/>
+          <w:lang w:val="en-US"/>
+        </w:rPr>
+        <w:t>Computer Science</w:t>
+      </w:r>
+    </w:p>
+    <w:p>
+      <w:pPr>
+        <w:spacing w:line="360" w:lineRule="auto"/>
+        <w:jc w:val="center"/>
+        <w:rPr>
+          <w:rFonts w:ascii="Times New Roman" w:eastAsia="Times New Roman" w:hAnsi="Times New Roman" w:cs="Times New Roman"/>
+          <w:sz w:val="24"/>
+          <w:szCs w:val="24"/>
+        </w:rPr>
+      </w:pPr>
+    </w:p>
+    <w:p>
+      <w:pPr>
+        <w:spacing w:line="360" w:lineRule="auto"/>
+        <w:jc w:val="center"/>
+        <w:rPr>
+          <w:rFonts w:ascii="Times New Roman" w:eastAsia="Times New Roman" w:hAnsi="Times New Roman" w:cs="Times New Roman"/>
+          <w:sz w:val="24"/>
+          <w:szCs w:val="24"/>
+        </w:rPr>
+      </w:pPr>
+    </w:p>
+    <w:p>
+      <w:pPr>
+        <w:spacing w:line="360" w:lineRule="auto"/>
+        <w:rPr>
+          <w:rFonts w:ascii="Times New Roman" w:eastAsia="Times New Roman" w:hAnsi="Times New Roman" w:cs="Times New Roman"/>
+          <w:sz w:val="24"/>
+          <w:szCs w:val="24"/>
+        </w:rPr>
+      </w:pPr>
+    </w:p>
+    <w:p>
+      <w:pPr>
+        <w:spacing w:line="360" w:lineRule="auto"/>
+        <w:jc w:val="center"/>
+        <w:rPr>
+          <w:rFonts w:ascii="Times New Roman" w:eastAsia="Times New Roman" w:hAnsi="Times New Roman" w:cs="Times New Roman"/>
+          <w:sz w:val="24"/>
+          <w:szCs w:val="24"/>
+        </w:rPr>
+      </w:pPr>
+    </w:p>
+    <w:p>
+      <w:pPr>
+        <w:spacing w:line="360" w:lineRule="auto"/>
+        <w:jc w:val="center"/>
+        <w:rPr>
+          <w:rFonts w:ascii="Times New Roman" w:eastAsia="MS Mincho" w:hAnsi="Times New Roman" w:cs="Times New Roman"/>
+          <w:b/>
+          <w:sz w:val="24"/>
+          <w:szCs w:val="24"/>
+          <w:lang w:val="en-US"/>
+        </w:rPr>
+      </w:pPr>
+      <w:r>
+        <w:rPr>
+          <w:rFonts w:ascii="Times New Roman" w:eastAsia="MS Mincho" w:hAnsi="Times New Roman" w:cs="Times New Roman"/>
+          <w:b/>
+          <w:sz w:val="24"/>
+          <w:szCs w:val="24"/>
+          <w:lang w:val="en-US"/>
+        </w:rPr>
+        <w:t>Graduation Thesis submitted in partial fulfillment of the requirements leading to the award of Bachelor of Science (Hons) in Information Technology</w:t>
+      </w:r>
+    </w:p>
+    <w:p>
+      <w:pPr>
+        <w:spacing w:line="360" w:lineRule="auto"/>
+        <w:jc w:val="center"/>
+        <w:rPr>
+          <w:rFonts w:ascii="Times New Roman" w:eastAsia="MS Mincho" w:hAnsi="Times New Roman" w:cs="Times New Roman"/>
+          <w:b/>
+          <w:sz w:val="24"/>
+          <w:szCs w:val="24"/>
+          <w:lang w:val="en-US"/>
+        </w:rPr>
+      </w:pPr>
+    </w:p>
+    <w:p>
+      <w:pPr>
+        <w:spacing w:line="360" w:lineRule="auto"/>
+        <w:jc w:val="center"/>
+        <w:rPr>
+          <w:rFonts w:ascii="Times New Roman" w:eastAsia="MS Mincho" w:hAnsi="Times New Roman" w:cs="Times New Roman"/>
+          <w:b/>
+          <w:sz w:val="24"/>
+          <w:szCs w:val="24"/>
+          <w:lang w:val="en-US"/>
+        </w:rPr>
+      </w:pPr>
+      <w:proofErr w:type="gramStart"/>
+      <w:r>
+        <w:rPr>
+          <w:rFonts w:ascii="Times New Roman" w:eastAsia="MS Mincho" w:hAnsi="Times New Roman" w:cs="Times New Roman"/>
+          <w:b/>
+          <w:sz w:val="24"/>
+          <w:szCs w:val="24"/>
+          <w:lang w:val="en-US"/>
+        </w:rPr>
+        <w:t>By</w:t>
+      </w:r>
+      <w:proofErr w:type="gramEnd"/>
+    </w:p>
+    <w:p>
+      <w:pPr>
+        <w:spacing w:line="360" w:lineRule="auto"/>
+        <w:jc w:val="center"/>
+        <w:rPr>
+          <w:rFonts w:ascii="Times New Roman" w:eastAsia="MS Mincho" w:hAnsi="Times New Roman" w:cs="Times New Roman"/>
+          <w:b/>
+          <w:bCs/>
+          <w:sz w:val="24"/>
+          <w:szCs w:val="24"/>
+          <w:lang w:val="en-US"/>
+        </w:rPr>
+      </w:pPr>
+      <w:r>
+        <w:rPr>
+          <w:rFonts w:ascii="Times New Roman" w:eastAsia="MS Mincho" w:hAnsi="Times New Roman" w:cs="Times New Roman"/>
+          <w:b/>
+          <w:bCs/>
+          <w:sz w:val="24"/>
+          <w:szCs w:val="24"/>
+          <w:lang w:val="en-US"/>
+        </w:rPr>
+        <w:t>ANTHONY BUSH CASTRO</w:t>
+      </w:r>
+      <w:r>
+        <w:rPr>
+          <w:rFonts w:ascii="Times New Roman" w:eastAsia="MS Mincho" w:hAnsi="Times New Roman" w:cs="Times New Roman"/>
+          <w:b/>
+          <w:bCs/>
+          <w:sz w:val="24"/>
+          <w:szCs w:val="24"/>
+          <w:lang w:val="en-US"/>
+        </w:rPr>
+        <w:t xml:space="preserve">  </w:t>
+      </w:r>
+      <w:r>
+        <w:rPr>
+          <w:rFonts w:ascii="Times New Roman" w:eastAsia="MS Mincho" w:hAnsi="Times New Roman" w:cs="Times New Roman"/>
+          <w:b/>
+          <w:bCs/>
+          <w:sz w:val="24"/>
+          <w:szCs w:val="24"/>
+          <w:lang w:val="en-US"/>
+        </w:rPr>
+        <w:t>20</w:t>
+      </w:r>
+      <w:r>
+        <w:rPr>
+          <w:rFonts w:ascii="Times New Roman" w:eastAsia="MS Mincho" w:hAnsi="Times New Roman" w:cs="Times New Roman"/>
+          <w:b/>
+          <w:bCs/>
+          <w:sz w:val="24"/>
+          <w:szCs w:val="24"/>
+          <w:lang w:val="en-US"/>
+        </w:rPr>
+        <w:t>-C</w:t>
+      </w:r>
+      <w:r>
+        <w:rPr>
+          <w:rFonts w:ascii="Times New Roman" w:eastAsia="MS Mincho" w:hAnsi="Times New Roman" w:cs="Times New Roman"/>
+          <w:b/>
+          <w:bCs/>
+          <w:sz w:val="24"/>
+          <w:szCs w:val="24"/>
+          <w:lang w:val="en-US"/>
+        </w:rPr>
+        <w:t>CS</w:t>
+      </w:r>
+      <w:r>
+        <w:rPr>
+          <w:rFonts w:ascii="Times New Roman" w:eastAsia="MS Mincho" w:hAnsi="Times New Roman" w:cs="Times New Roman"/>
+          <w:b/>
+          <w:bCs/>
+          <w:sz w:val="24"/>
+          <w:szCs w:val="24"/>
+          <w:lang w:val="en-US"/>
+        </w:rPr>
+        <w:t>-</w:t>
+      </w:r>
+      <w:r>
+        <w:rPr>
+          <w:rFonts w:ascii="Times New Roman" w:eastAsia="MS Mincho" w:hAnsi="Times New Roman" w:cs="Times New Roman"/>
+          <w:b/>
+          <w:bCs/>
+          <w:sz w:val="24"/>
+          <w:szCs w:val="24"/>
+          <w:lang w:val="en-US"/>
+        </w:rPr>
+        <w:t>281</w:t>
+      </w:r>
+    </w:p>
+    <w:p>
+      <w:pPr>
+        <w:spacing w:line="360" w:lineRule="auto"/>
+        <w:jc w:val="center"/>
+        <w:rPr>
+          <w:rFonts w:ascii="Times New Roman" w:eastAsia="MS Mincho" w:hAnsi="Times New Roman" w:cs="Times New Roman"/>
+          <w:b/>
+          <w:sz w:val="24"/>
+          <w:szCs w:val="24"/>
+          <w:lang w:val="en-US"/>
+        </w:rPr>
+      </w:pPr>
+    </w:p>
+    <w:p>
+      <w:pPr>
+        <w:spacing w:line="360" w:lineRule="auto"/>
+        <w:jc w:val="center"/>
+        <w:rPr>
+          <w:rFonts w:ascii="Times New Roman" w:eastAsia="MS Mincho" w:hAnsi="Times New Roman" w:cs="Times New Roman"/>
+          <w:b/>
+          <w:sz w:val="24"/>
+          <w:szCs w:val="24"/>
+          <w:lang w:val="en-US"/>
+        </w:rPr>
+      </w:pPr>
+      <w:r>
+        <w:rPr>
+          <w:rFonts w:ascii="Times New Roman" w:eastAsia="MS Mincho" w:hAnsi="Times New Roman" w:cs="Times New Roman"/>
+          <w:b/>
+          <w:sz w:val="24"/>
+          <w:szCs w:val="24"/>
+          <w:lang w:val="en-US"/>
+        </w:rPr>
+        <w:t>Under the Supervision of</w:t>
+      </w:r>
+    </w:p>
+    <w:p>
+      <w:pPr>
+        <w:spacing w:line="360" w:lineRule="auto"/>
+        <w:jc w:val="center"/>
+        <w:rPr>
+          <w:rFonts w:ascii="Times New Roman" w:eastAsia="MS Mincho" w:hAnsi="Times New Roman" w:cs="Times New Roman"/>
+          <w:b/>
+          <w:bCs/>
+          <w:sz w:val="24"/>
+          <w:szCs w:val="24"/>
+          <w:lang w:val="en-US"/>
+        </w:rPr>
+      </w:pPr>
+      <w:r>
+        <w:rPr>
+          <w:rFonts w:ascii="Times New Roman" w:eastAsia="MS Mincho" w:hAnsi="Times New Roman" w:cs="Times New Roman"/>
+          <w:b/>
+          <w:bCs/>
+          <w:sz w:val="24"/>
+          <w:szCs w:val="24"/>
+          <w:lang w:val="en-US"/>
+        </w:rPr>
+        <w:t xml:space="preserve">Supervised By: Dr. </w:t>
+      </w:r>
+      <w:proofErr w:type="spellStart"/>
+      <w:r>
+        <w:rPr>
+          <w:rFonts w:ascii="Times New Roman" w:eastAsia="MS Mincho" w:hAnsi="Times New Roman" w:cs="Times New Roman"/>
+          <w:b/>
+          <w:bCs/>
+          <w:sz w:val="24"/>
+          <w:szCs w:val="24"/>
+          <w:lang w:val="en-US"/>
+        </w:rPr>
+        <w:t>Manzu</w:t>
+      </w:r>
+      <w:proofErr w:type="spellEnd"/>
+      <w:r>
+        <w:rPr>
+          <w:rFonts w:ascii="Times New Roman" w:eastAsia="MS Mincho" w:hAnsi="Times New Roman" w:cs="Times New Roman"/>
+          <w:b/>
+          <w:bCs/>
+          <w:sz w:val="24"/>
+          <w:szCs w:val="24"/>
+          <w:lang w:val="en-US"/>
+        </w:rPr>
+        <w:t xml:space="preserve"> Gerald S. Kenyi</w:t>
+      </w:r>
+      <w:r>
+        <w:rPr>
+          <w:rFonts w:ascii="Times New Roman" w:eastAsia="MS Mincho" w:hAnsi="Times New Roman" w:cs="Times New Roman"/>
+          <w:b/>
+          <w:bCs/>
+          <w:sz w:val="24"/>
+          <w:szCs w:val="24"/>
+          <w:lang w:val="en-US"/>
+        </w:rPr>
+        <w:t xml:space="preserve">,  </w:t>
+      </w:r>
+      <w:proofErr w:type="spellStart"/>
+      <w:r>
+        <w:rPr>
+          <w:rFonts w:ascii="Times New Roman" w:eastAsia="MS Mincho" w:hAnsi="Times New Roman" w:cs="Times New Roman"/>
+          <w:b/>
+          <w:bCs/>
+          <w:sz w:val="24"/>
+          <w:szCs w:val="24"/>
+          <w:lang w:val="en-US"/>
+        </w:rPr>
+        <w:t>Ph.D</w:t>
+      </w:r>
+      <w:proofErr w:type="spellEnd"/>
+    </w:p>
+    <w:p>
+      <w:pPr>
+        <w:spacing w:line="360" w:lineRule="auto"/>
+        <w:jc w:val="center"/>
+        <w:rPr>
+          <w:rFonts w:ascii="Times New Roman" w:eastAsia="MS Mincho" w:hAnsi="Times New Roman" w:cs="Times New Roman"/>
+          <w:b/>
+          <w:bCs/>
+          <w:sz w:val="24"/>
+          <w:szCs w:val="24"/>
+          <w:lang w:val="en-US"/>
+        </w:rPr>
+      </w:pPr>
+    </w:p>
+    <w:p>
+      <w:pPr>
+        <w:spacing w:line="360" w:lineRule="auto"/>
+        <w:jc w:val="center"/>
+        <w:rPr>
+          <w:rFonts w:ascii="Times New Roman" w:eastAsia="MS Mincho" w:hAnsi="Times New Roman" w:cs="Times New Roman"/>
+          <w:b/>
+          <w:bCs/>
+          <w:sz w:val="24"/>
+          <w:szCs w:val="24"/>
+          <w:lang w:val="en-US"/>
+        </w:rPr>
+      </w:pPr>
+    </w:p>
+    <w:p>
+      <w:pPr>
+        <w:spacing w:line="360" w:lineRule="auto"/>
+        <w:jc w:val="center"/>
+        <w:rPr>
+          <w:rFonts w:ascii="Times New Roman" w:eastAsia="MS Mincho" w:hAnsi="Times New Roman" w:cs="Times New Roman"/>
+          <w:b/>
+          <w:color w:val="1F497D" w:themeColor="text2"/>
+          <w:sz w:val="24"/>
+          <w:szCs w:val="24"/>
+          <w:lang w:val="en-US"/>
+        </w:rPr>
+      </w:pPr>
+    </w:p>
+    <w:p>
+      <w:pPr>
+        <w:spacing w:line="360" w:lineRule="auto"/>
+        <w:jc w:val="right"/>
+        <w:rPr>
+          <w:rFonts w:ascii="Times New Roman" w:eastAsia="MS Mincho" w:hAnsi="Times New Roman" w:cs="Times New Roman"/>
+          <w:b/>
+          <w:color w:val="1F497D" w:themeColor="text2"/>
+          <w:sz w:val="24"/>
+          <w:szCs w:val="24"/>
+          <w:lang w:val="en-US"/>
         </w:rPr>
       </w:pPr>
       <w:r>
@@ -6709,7 +6736,27 @@
           <w:szCs w:val="24"/>
           <w:lang w:val="en-US"/>
         </w:rPr>
-        <w:t>CRFs and RFs. Through its rigorous analysis, the research provides actionable insights that can help guide model selection for NER tasks in real-world NLP applications. By addressing the comparative performance, domain adaptability, and trade-offs between interpretability and sequence modeling, this research contributes novel perspectives that could inspire future advancements in NER modeling, including the development of hybrid models that capitalize on the strengths of both CRFs and RFs.</w:t>
+        <w:t xml:space="preserve">CRFs and RFs. Through its rigorous analysis, the research provides actionable insights that can help guide model selection for NER tasks in real-world NLP applications. By addressing </w:t>
+      </w:r>
+      <w:proofErr w:type="gramStart"/>
+      <w:r>
+        <w:rPr>
+          <w:rFonts w:ascii="Times New Roman" w:eastAsia="Times New Roman" w:hAnsi="Times New Roman" w:cs="Times New Roman"/>
+          <w:sz w:val="24"/>
+          <w:szCs w:val="24"/>
+          <w:lang w:val="en-US"/>
+        </w:rPr>
+        <w:t>the comparative</w:t>
+      </w:r>
+      <w:proofErr w:type="gramEnd"/>
+      <w:r>
+        <w:rPr>
+          <w:rFonts w:ascii="Times New Roman" w:eastAsia="Times New Roman" w:hAnsi="Times New Roman" w:cs="Times New Roman"/>
+          <w:sz w:val="24"/>
+          <w:szCs w:val="24"/>
+          <w:lang w:val="en-US"/>
+        </w:rPr>
+        <w:t xml:space="preserve"> performance, domain adaptability, and trade-offs between interpretability and sequence modeling, this research contributes novel perspectives that could inspire future advancements in NER modeling, including the development of hybrid models that capitalize on the strengths of both CRFs and RFs.</w:t>
       </w:r>
     </w:p>
     <w:p>
@@ -6911,7 +6958,17 @@
                                 <w:sz w:val="24"/>
                                 <w:szCs w:val="24"/>
                               </w:rPr>
-                              <w:t>. Three evaluation metrics were used: precision, recall, and F1-scores.</w:t>
+                              <w:t>. Three evaluation metrics were used: precision, recall, and F1-</w:t>
+                            </w:r>
+                            <w:proofErr w:type="gramStart"/>
+                            <w:r>
+                              <w:rPr>
+                                <w:rFonts w:ascii="Times New Roman" w:hAnsi="Times New Roman" w:cs="Times New Roman"/>
+                                <w:color w:val="4F81BD" w:themeColor="accent1"/>
+                                <w:sz w:val="24"/>
+                                <w:szCs w:val="24"/>
+                              </w:rPr>
+                              <w:t>scores.</w:t>
                             </w:r>
                             <w:r>
                               <w:rPr>
@@ -6922,6 +6979,7 @@
                               </w:rPr>
                               <w:t>.</w:t>
                             </w:r>
+                            <w:proofErr w:type="gramEnd"/>
                           </w:p>
                           <w:p>
                             <w:pPr>
@@ -8362,13 +8420,23 @@
         <w:t>The CoNLL-2003 dataset, retrieved through the Hugging Face Datasets library (</w:t>
       </w:r>
       <w:proofErr w:type="spellStart"/>
-      <w:r>
-        <w:rPr>
-          <w:rFonts w:ascii="Times New Roman" w:hAnsi="Times New Roman" w:cs="Times New Roman"/>
-          <w:sz w:val="24"/>
-          <w:szCs w:val="24"/>
-        </w:rPr>
-        <w:t>datasets.load_dataset</w:t>
+      <w:proofErr w:type="gramStart"/>
+      <w:r>
+        <w:rPr>
+          <w:rFonts w:ascii="Times New Roman" w:hAnsi="Times New Roman" w:cs="Times New Roman"/>
+          <w:sz w:val="24"/>
+          <w:szCs w:val="24"/>
+        </w:rPr>
+        <w:t>datasets.load</w:t>
+      </w:r>
+      <w:proofErr w:type="gramEnd"/>
+      <w:r>
+        <w:rPr>
+          <w:rFonts w:ascii="Times New Roman" w:hAnsi="Times New Roman" w:cs="Times New Roman"/>
+          <w:sz w:val="24"/>
+          <w:szCs w:val="24"/>
+        </w:rPr>
+        <w:t>_dataset</w:t>
       </w:r>
       <w:proofErr w:type="spellEnd"/>
       <w:r>
@@ -11918,6 +11986,7 @@
               </w:rPr>
             </w:pPr>
             <w:proofErr w:type="spellStart"/>
+            <w:proofErr w:type="gramStart"/>
             <w:r>
               <w:rPr>
                 <w:rFonts w:ascii="Times New Roman" w:eastAsia="Times New Roman" w:hAnsi="Times New Roman" w:cs="Times New Roman"/>
@@ -11925,7 +11994,16 @@
                 <w:szCs w:val="24"/>
               </w:rPr>
               <w:lastRenderedPageBreak/>
-              <w:t>sklearn.ensemble.RandomForestClassifier</w:t>
+              <w:t>sklearn.ensemble</w:t>
+            </w:r>
+            <w:proofErr w:type="gramEnd"/>
+            <w:r>
+              <w:rPr>
+                <w:rFonts w:ascii="Times New Roman" w:eastAsia="Times New Roman" w:hAnsi="Times New Roman" w:cs="Times New Roman"/>
+                <w:sz w:val="24"/>
+                <w:szCs w:val="24"/>
+              </w:rPr>
+              <w:t>.RandomForestClassifier</w:t>
             </w:r>
             <w:proofErr w:type="spellEnd"/>
           </w:p>
@@ -11999,13 +12077,23 @@
               </w:rPr>
             </w:pPr>
             <w:proofErr w:type="spellStart"/>
+            <w:proofErr w:type="gramStart"/>
             <w:r>
               <w:rPr>
                 <w:rFonts w:ascii="Times New Roman" w:eastAsia="Times New Roman" w:hAnsi="Times New Roman" w:cs="Times New Roman"/>
                 <w:sz w:val="24"/>
                 <w:szCs w:val="24"/>
               </w:rPr>
-              <w:t>sklearn.feature_extraction.DictVectorizer</w:t>
+              <w:t>sklearn.feature</w:t>
+            </w:r>
+            <w:proofErr w:type="gramEnd"/>
+            <w:r>
+              <w:rPr>
+                <w:rFonts w:ascii="Times New Roman" w:eastAsia="Times New Roman" w:hAnsi="Times New Roman" w:cs="Times New Roman"/>
+                <w:sz w:val="24"/>
+                <w:szCs w:val="24"/>
+              </w:rPr>
+              <w:t>_extraction.DictVectorizer</w:t>
             </w:r>
             <w:proofErr w:type="spellEnd"/>
           </w:p>
@@ -12079,6 +12167,7 @@
               </w:rPr>
             </w:pPr>
             <w:proofErr w:type="spellStart"/>
+            <w:proofErr w:type="gramStart"/>
             <w:r>
               <w:rPr>
                 <w:rFonts w:ascii="Times New Roman" w:eastAsia="Times New Roman" w:hAnsi="Times New Roman" w:cs="Times New Roman"/>
@@ -12088,6 +12177,7 @@
               <w:t>sklearn.metrics</w:t>
             </w:r>
             <w:proofErr w:type="spellEnd"/>
+            <w:proofErr w:type="gramEnd"/>
           </w:p>
         </w:tc>
         <w:tc>
@@ -12159,13 +12249,23 @@
               </w:rPr>
             </w:pPr>
             <w:proofErr w:type="spellStart"/>
+            <w:proofErr w:type="gramStart"/>
             <w:r>
               <w:rPr>
                 <w:rFonts w:ascii="Times New Roman" w:eastAsia="Times New Roman" w:hAnsi="Times New Roman" w:cs="Times New Roman"/>
                 <w:sz w:val="24"/>
                 <w:szCs w:val="24"/>
               </w:rPr>
-              <w:t>sklearn.model.selection.train_test_split</w:t>
+              <w:t>sklearn.model</w:t>
+            </w:r>
+            <w:proofErr w:type="gramEnd"/>
+            <w:r>
+              <w:rPr>
+                <w:rFonts w:ascii="Times New Roman" w:eastAsia="Times New Roman" w:hAnsi="Times New Roman" w:cs="Times New Roman"/>
+                <w:sz w:val="24"/>
+                <w:szCs w:val="24"/>
+              </w:rPr>
+              <w:t>.selection.train_test_split</w:t>
             </w:r>
             <w:proofErr w:type="spellEnd"/>
           </w:p>
@@ -12239,13 +12339,23 @@
               </w:rPr>
             </w:pPr>
             <w:proofErr w:type="spellStart"/>
+            <w:proofErr w:type="gramStart"/>
             <w:r>
               <w:rPr>
                 <w:rFonts w:ascii="Times New Roman" w:eastAsia="Times New Roman" w:hAnsi="Times New Roman" w:cs="Times New Roman"/>
                 <w:sz w:val="24"/>
                 <w:szCs w:val="24"/>
               </w:rPr>
-              <w:t>sklearn.pipeline.pipeline</w:t>
+              <w:t>sklearn.pipeline</w:t>
+            </w:r>
+            <w:proofErr w:type="gramEnd"/>
+            <w:r>
+              <w:rPr>
+                <w:rFonts w:ascii="Times New Roman" w:eastAsia="Times New Roman" w:hAnsi="Times New Roman" w:cs="Times New Roman"/>
+                <w:sz w:val="24"/>
+                <w:szCs w:val="24"/>
+              </w:rPr>
+              <w:t>.pipeline</w:t>
             </w:r>
             <w:proofErr w:type="spellEnd"/>
           </w:p>
@@ -13311,7 +13421,23 @@
           <w:rFonts w:ascii="Times New Roman" w:hAnsi="Times New Roman" w:cs="Times New Roman"/>
           <w:sz w:val="18"/>
         </w:rPr>
-        <w:t>3. Biradar, U.B. et al. (2016) ‘Machine Learning Approach for Multi-Layered Detection of Chemical Named Entities in Text’:, International Journal of Software Science and Computational Intelligence, 8(1), pp. 1–15. Available at: https://doi.org/10.4018/IJSSCI.2016010101.</w:t>
+        <w:t>3. Biradar, U.B. et al. (2016) ‘Machine Learning Approach for Multi-Layered Detection of Chemical Named Entities in Text</w:t>
+      </w:r>
+      <w:proofErr w:type="gramStart"/>
+      <w:r>
+        <w:rPr>
+          <w:rFonts w:ascii="Times New Roman" w:hAnsi="Times New Roman" w:cs="Times New Roman"/>
+          <w:sz w:val="18"/>
+        </w:rPr>
+        <w:t>’:,</w:t>
+      </w:r>
+      <w:proofErr w:type="gramEnd"/>
+      <w:r>
+        <w:rPr>
+          <w:rFonts w:ascii="Times New Roman" w:hAnsi="Times New Roman" w:cs="Times New Roman"/>
+          <w:sz w:val="18"/>
+        </w:rPr>
+        <w:t xml:space="preserve"> International Journal of Software Science and Computational Intelligence, 8(1), pp. 1–15. Available at: https://doi.org/10.4018/IJSSCI.2016010101.</w:t>
       </w:r>
     </w:p>
     <w:p>
@@ -13377,7 +13503,23 @@
           <w:rFonts w:ascii="Times New Roman" w:hAnsi="Times New Roman" w:cs="Times New Roman"/>
           <w:sz w:val="18"/>
         </w:rPr>
-        <w:t>5. Daniel, J. and James H., M. (2000) Speech and Language Processing: An Introduction to Natural Language Processing, Computational Linguistics, and Speech Recognition | Guide books | ACM Digital Library. Available at: https://dl.acm.org/doi/book/10.5555/555733 (Accessed: 7 April 2025).</w:t>
+        <w:t xml:space="preserve">5. Daniel, J. and James H., M. (2000) Speech and Language Processing: An Introduction to Natural Language Processing, Computational Linguistics, and Speech Recognition | </w:t>
+      </w:r>
+      <w:proofErr w:type="gramStart"/>
+      <w:r>
+        <w:rPr>
+          <w:rFonts w:ascii="Times New Roman" w:hAnsi="Times New Roman" w:cs="Times New Roman"/>
+          <w:sz w:val="18"/>
+        </w:rPr>
+        <w:t>Guide books</w:t>
+      </w:r>
+      <w:proofErr w:type="gramEnd"/>
+      <w:r>
+        <w:rPr>
+          <w:rFonts w:ascii="Times New Roman" w:hAnsi="Times New Roman" w:cs="Times New Roman"/>
+          <w:sz w:val="18"/>
+        </w:rPr>
+        <w:t xml:space="preserve"> | ACM Digital Library. Available at: https://dl.acm.org/doi/book/10.5555/555733 (Accessed: 7 April 2025).</w:t>
       </w:r>
     </w:p>
     <w:p>
@@ -13950,7 +14092,23 @@
           <w:sz w:val="18"/>
         </w:rPr>
         <w:lastRenderedPageBreak/>
-        <w:t>of the ACL  - ACL ’06. the 21st International Conference, Sydney, Australia: Association for Computational Linguistics, pp. 465–472. Available at: https://doi.org/10.3115/1220175.1220234.</w:t>
+        <w:t xml:space="preserve">of the </w:t>
+      </w:r>
+      <w:proofErr w:type="gramStart"/>
+      <w:r>
+        <w:rPr>
+          <w:rFonts w:ascii="Times New Roman" w:hAnsi="Times New Roman" w:cs="Times New Roman"/>
+          <w:sz w:val="18"/>
+        </w:rPr>
+        <w:t>ACL  -</w:t>
+      </w:r>
+      <w:proofErr w:type="gramEnd"/>
+      <w:r>
+        <w:rPr>
+          <w:rFonts w:ascii="Times New Roman" w:hAnsi="Times New Roman" w:cs="Times New Roman"/>
+          <w:sz w:val="18"/>
+        </w:rPr>
+        <w:t xml:space="preserve"> ACL ’06. the 21st International Conference, Sydney, Australia: Association for Computational Linguistics, pp. 465–472. Available at: https://doi.org/10.3115/1220175.1220234.</w:t>
       </w:r>
     </w:p>
     <w:p>
@@ -19043,6 +19201,24 @@
       <w:color w:val="666666"/>
     </w:rPr>
   </w:style>
+  <w:style w:type="paragraph" w:styleId="Date">
+    <w:name w:val="Date"/>
+    <w:basedOn w:val="Normal"/>
+    <w:next w:val="Normal"/>
+    <w:link w:val="DateChar"/>
+    <w:uiPriority w:val="99"/>
+    <w:semiHidden/>
+    <w:unhideWhenUsed/>
+    <w:rsid w:val="005C2DE5"/>
+  </w:style>
+  <w:style w:type="character" w:customStyle="1" w:styleId="DateChar">
+    <w:name w:val="Date Char"/>
+    <w:basedOn w:val="DefaultParagraphFont"/>
+    <w:link w:val="Date"/>
+    <w:uiPriority w:val="99"/>
+    <w:semiHidden/>
+    <w:rsid w:val="005C2DE5"/>
+  </w:style>
 </w:styles>
 </file>
 

</xml_diff>